<commit_message>
feat(resume): finalize authentic A4 resume generation, project reconciliation, link layout and geometry balance
- Restore authentic source-grounded professional summary and eliminate generic fallbacks
- Reconcile project inventory to prioritize substantive projects (AI-Powered Code Review Assistant, Product Data Explorer, Collaborative Task Manager) and suppress redundant paragraph descriptions when accomplishment bullets are present
- Format candidate profile links on one centered line at ~8.5pt font in Latin Modern Roman with verified clickable hyperlinks
- Condition technical skills truthfully: NestJS in Backend & APIs, Express.js (INFERRED) omitted, Languages first, Cloud/DevOps at bottom
- Calibrate page geometry to target 12-18mm bottom margin on single-page A4
- Add 6-candidate regression matrix and unit tests guaranteeing 100% genericity and multi-tenant isolation
- Update project.md with UNIFIED-RESUME-A4-VERIFICATION-014 ledger entry
</commit_message>
<xml_diff>
--- a/output/resume-studio/experienced.docx
+++ b/output/resume-studio/experienced.docx
@@ -1,6 +1,6 @@
 
 <file path=word/document.xml><?xml version="1.0" encoding="utf-8"?>
-<w:document xmlns:w="http://schemas.openxmlformats.org/wordprocessingml/2006/main">
+<w:document xmlns:w="http://schemas.openxmlformats.org/wordprocessingml/2006/main" xmlns:r="http://schemas.openxmlformats.org/officeDocument/2006/relationships">
   <w:body>
     <w:p>
       <w:pPr>
@@ -22,17 +22,29 @@
       <w:pPr>
         <w:pStyle w:val="Normal"/>
       </w:pPr>
-      <w:r>
-        <w:t xml:space="preserve">https://github.com/source-fixture</w:t>
-      </w:r>
-    </w:p>
-    <w:p>
-      <w:pPr>
-        <w:pStyle w:val="Normal"/>
-      </w:pPr>
-      <w:r>
-        <w:t xml:space="preserve">https://portfolio.example.test</w:t>
-      </w:r>
+      <w:hyperlink r:id="rId3" w:history="1">
+        <w:r>
+          <w:rPr>
+            <w:rStyle w:val="Hyperlink"/>
+            <w:color w:val="000000"/>
+            <w:u w:val="none"/>
+          </w:rPr>
+          <w:t xml:space="preserve">github.com/source-fixture</w:t>
+        </w:r>
+      </w:hyperlink>
+      <w:r>
+        <w:t xml:space="preserve"> | </w:t>
+      </w:r>
+      <w:hyperlink r:id="rId4" w:history="1">
+        <w:r>
+          <w:rPr>
+            <w:rStyle w:val="Hyperlink"/>
+            <w:color w:val="000000"/>
+            <w:u w:val="none"/>
+          </w:rPr>
+          <w:t xml:space="preserve">portfolio.example.test</w:t>
+        </w:r>
+      </w:hyperlink>
     </w:p>
     <w:p>
       <w:pPr>
@@ -583,5 +595,15 @@
       <w:szCs w:val="20"/>
     </w:rPr>
   </w:style>
+  <w:style w:type="character" w:styleId="Hyperlink">
+    <w:name w:val="Hyperlink"/>
+    <w:basedOn w:val="DefaultParagraphFont"/>
+    <w:uiPriority w:val="99"/>
+    <w:unhideWhenUsed/>
+    <w:rPr>
+      <w:color w:val="000000"/>
+      <w:u w:val="none"/>
+    </w:rPr>
+  </w:style>
 </w:styles>
 </file>
</xml_diff>